<commit_message>
edit FigureS1. add apobec ms
</commit_message>
<xml_diff>
--- a/ms-2026-05-16.docx
+++ b/ms-2026-05-16.docx
@@ -1711,34 +1711,14 @@
       <w:pPr>
         <w:pStyle w:val="normalfirst"/>
         <w:rPr>
-          <w:rFonts w:eastAsia="宋体" w:hint="eastAsia"/>
-          <w:b/>
-          <w:bCs/>
-          <w:i/>
-          <w:iCs/>
-        </w:rPr>
-      </w:pPr>
-      <w:commentRangeStart w:id="17"/>
-      <w:r>
-        <w:rPr>
           <w:rFonts w:eastAsia="宋体"/>
           <w:b/>
           <w:bCs/>
           <w:i/>
           <w:iCs/>
         </w:rPr>
-        <w:t>InsDel_Aβ</w:t>
-      </w:r>
-      <w:r>
-        <w:rPr>
-          <w:rFonts w:eastAsia="宋体" w:hint="eastAsia"/>
-          <w:b/>
-          <w:bCs/>
-          <w:i/>
-          <w:iCs/>
-        </w:rPr>
-        <w:t xml:space="preserve"> and SBS2/SBS13</w:t>
-      </w:r>
+      </w:pPr>
+      <w:commentRangeStart w:id="17"/>
       <w:r>
         <w:rPr>
           <w:rFonts w:eastAsia="宋体"/>
@@ -1747,7 +1727,7 @@
           <w:i/>
           <w:iCs/>
         </w:rPr>
-        <w:t xml:space="preserve"> Share Sequence Specificity</w:t>
+        <w:t>InsDel_Aβ</w:t>
       </w:r>
       <w:r>
         <w:rPr>
@@ -1757,16 +1737,36 @@
           <w:i/>
           <w:iCs/>
         </w:rPr>
-        <w:t xml:space="preserve"> due to APOBEC</w:t>
-      </w:r>
-      <w:r>
-        <w:rPr>
-          <w:rFonts w:eastAsia="宋体" w:hint="eastAsia"/>
+        <w:t xml:space="preserve"> and SBS2/SBS13</w:t>
+      </w:r>
+      <w:r>
+        <w:rPr>
+          <w:rFonts w:eastAsia="宋体"/>
           <w:b/>
           <w:bCs/>
           <w:i/>
           <w:iCs/>
         </w:rPr>
+        <w:t xml:space="preserve"> Share Sequence Specificity</w:t>
+      </w:r>
+      <w:r>
+        <w:rPr>
+          <w:rFonts w:eastAsia="宋体" w:hint="eastAsia"/>
+          <w:b/>
+          <w:bCs/>
+          <w:i/>
+          <w:iCs/>
+        </w:rPr>
+        <w:t xml:space="preserve"> due to APOBEC</w:t>
+      </w:r>
+      <w:r>
+        <w:rPr>
+          <w:rFonts w:eastAsia="宋体" w:hint="eastAsia"/>
+          <w:b/>
+          <w:bCs/>
+          <w:i/>
+          <w:iCs/>
+        </w:rPr>
         <w:t>3A Overexpression</w:t>
       </w:r>
     </w:p>
@@ -1799,7 +1799,31 @@
         <w:rPr>
           <w:rFonts w:eastAsia="宋体" w:hint="eastAsia"/>
         </w:rPr>
-        <w:t>type classfication</w:t>
+        <w:t xml:space="preserve">type </w:t>
+      </w:r>
+      <w:r>
+        <w:rPr>
+          <w:rFonts w:eastAsia="宋体"/>
+        </w:rPr>
+        <w:t>classification</w:t>
+      </w:r>
+      <w:r>
+        <w:rPr>
+          <w:rFonts w:eastAsia="宋体" w:hint="eastAsia"/>
+        </w:rPr>
+        <w:t>, F</w:t>
+      </w:r>
+      <w:r>
+        <w:rPr>
+          <w:rFonts w:eastAsia="宋体"/>
+        </w:rPr>
+        <w:t>i</w:t>
+      </w:r>
+      <w:r>
+        <w:rPr>
+          <w:rFonts w:eastAsia="宋体" w:hint="eastAsia"/>
+        </w:rPr>
+        <w:t>gure S1C</w:t>
       </w:r>
       <w:r>
         <w:rPr>
@@ -1952,7 +1976,19 @@
         <w:rPr>
           <w:rFonts w:eastAsia="宋体"/>
         </w:rPr>
-        <w:t>CT motif; and (2) InsDel_Aα, defined by 1 bp C deletions from CT (89-category) and more specifically from GCT/TCT (476-category) motifs. Notably, InsDel_Aα is also associated with 2 bp deletions at short repeat sequences.</w:t>
+        <w:t>CT motif</w:t>
+      </w:r>
+      <w:r>
+        <w:rPr>
+          <w:rFonts w:eastAsia="宋体" w:hint="eastAsia"/>
+        </w:rPr>
+        <w:t xml:space="preserve"> (Figure S1C)</w:t>
+      </w:r>
+      <w:r>
+        <w:rPr>
+          <w:rFonts w:eastAsia="宋体"/>
+        </w:rPr>
+        <w:t>; and (2) InsDel_Aα, defined by 1 bp C deletions from CT (89-category) and more specifically from GCT/TCT (476-category) motifs. Notably, InsDel_Aα is also associated with 2 bp deletions at short repeat sequences.</w:t>
       </w:r>
       <w:commentRangeEnd w:id="17"/>
       <w:r>
@@ -2107,11 +2143,11 @@
         <w:t>(Figure 5)</w:t>
       </w:r>
       <w:r>
-        <w:t xml:space="preserve">. The APOBEC-related cluster includes SBS2 and SBS13 and showes moderate correlations with ID_A and InsDel_Aβ. The homologous recombination deficiency (dHR) cluster, consisting of </w:t>
+        <w:t xml:space="preserve">. The APOBEC-related cluster includes SBS2 and SBS13 and showes moderate correlations with </w:t>
       </w:r>
       <w:r>
         <w:lastRenderedPageBreak/>
-        <w:t>SBS3 and SBS8, was strongly associated with InsDel6 and InsDel9 (Figure 5, “HR defects”). UV-related signatures, such as SBS7a, SBS38, InsDel13, and InsDel_H, also clustered together, reflecting their shared etiology. The cluster related to POLE proofreading mutations was defined by the strong links between InsDel1b, InsDel_K, and SBS10a. Additional analysis of tumor somatic mutations confirmed that these signatures are associated with dysfunctional POLE proofreading and/or mismatch repair (see Table POLE/mmr checking).</w:t>
+        <w:t>ID_A and InsDel_Aβ. The homologous recombination deficiency (dHR) cluster, consisting of SBS3 and SBS8, was strongly associated with InsDel6 and InsDel9 (Figure 5, “HR defects”). UV-related signatures, such as SBS7a, SBS38, InsDel13, and InsDel_H, also clustered together, reflecting their shared etiology. The cluster related to POLE proofreading mutations was defined by the strong links between InsDel1b, InsDel_K, and SBS10a. Additional analysis of tumor somatic mutations confirmed that these signatures are associated with dysfunctional POLE proofreading and/or mismatch repair (see Table POLE/mmr checking).</w:t>
       </w:r>
     </w:p>
     <w:p>
@@ -2126,11 +2162,11 @@
     </w:p>
     <w:p>
       <w:r>
-        <w:t xml:space="preserve">These correlation patterns provide insight into the possible origins of previously uncharacterized SBS signatures. For example, SBS92 closely mirrored the correlation profile of SBS4, largely through its strong associations with C_ID3 and InsDel3b, pointing toward a </w:t>
+        <w:t xml:space="preserve">These correlation patterns provide insight into the possible origins of previously uncharacterized SBS signatures. For example, SBS92 closely mirrored the correlation profile of </w:t>
       </w:r>
       <w:r>
         <w:lastRenderedPageBreak/>
-        <w:t>potential link with tobacco smoking (Figure 5, “Lung Tobacco Smoking”). In the GI-ROS cluster, which includes signatures common in gastrointestinal tumors (SBS17, SBS18, SBS1, SBS88, and SBS93), we observed that C_ID18/InsDel18, ID_N, and InsDel_Nβ were more tightly linked to signatures typically seen in the GI tract. SBS93, in particular, shows a strong transcriptional strand bias, suggesting its association with specific DNA adducts in the GI tract and a possible connection to C_ID14/InsDel14 formation. Meanwhile, C_ID1 and InsDel1a exhibited stronger correlations with SBS1 and SBS18, supporting their association with mutagenesis driven by reactive oxygen species (Figure 5, “GI-ROS”).</w:t>
+        <w:t>SBS4, largely through its strong associations with C_ID3 and InsDel3b, pointing toward a potential link with tobacco smoking (Figure 5, “Lung Tobacco Smoking”). In the GI-ROS cluster, which includes signatures common in gastrointestinal tumors (SBS17, SBS18, SBS1, SBS88, and SBS93), we observed that C_ID18/InsDel18, ID_N, and InsDel_Nβ were more tightly linked to signatures typically seen in the GI tract. SBS93, in particular, shows a strong transcriptional strand bias, suggesting its association with specific DNA adducts in the GI tract and a possible connection to C_ID14/InsDel14 formation. Meanwhile, C_ID1 and InsDel1a exhibited stronger correlations with SBS1 and SBS18, supporting their association with mutagenesis driven by reactive oxygen species (Figure 5, “GI-ROS”).</w:t>
       </w:r>
     </w:p>
     <w:p>
@@ -2269,11 +2305,11 @@
         <w:t>with</w:t>
       </w:r>
       <w:r>
-        <w:t xml:space="preserve"> mutations enriched in the transcribed strand. Another exogenous mutational signature C_ID13, which is attributed to UV exposure, showed enrichment in the un-transcribed strand. This is due to the damage caused by UV happened on cytosine instead of guanine. In 83-type signatures associated with defective endogenous mutational processes, enriched mutations on the un-transcribed strand were observed for C_ID1 (slippage during DNA replication) and C_ID5 (clock-like signature), while </w:t>
+        <w:t xml:space="preserve"> mutations enriched in the transcribed strand. Another exogenous mutational signature C_ID13, which is attributed to UV exposure, showed enrichment in the un-transcribed strand. This is due to the damage caused by UV happened on cytosine instead of guanine. In 83-type signatures associated with defective endogenous mutational processes, enriched mutations on the un-transcribed strand were </w:t>
       </w:r>
       <w:r>
         <w:lastRenderedPageBreak/>
-        <w:t xml:space="preserve">enriched mutations on the transcribed strand were observed for </w:t>
+        <w:t xml:space="preserve">observed for C_ID1 (slippage during DNA replication) and C_ID5 (clock-like signature), while enriched mutations on the transcribed strand were observed for </w:t>
       </w:r>
       <w:r>
         <w:rPr>
@@ -2554,11 +2590,11 @@
         <w:t>)</w:t>
       </w:r>
       <w:r>
-        <w:t xml:space="preserve">. Most signatures were consistently enriched in late-replicating regions across different cancer types, while only two signatures, C_ID10 and C_ID17 (TOP2A K743N mediated mutagenesis), showed enrichment in early-replicating regions. Four signatures were un-affected by replication timing in the majority of cancers presenting this signature, including C_ID1 (Slippage during DNA replication), C_ID5 (Clock-like signature), </w:t>
+        <w:t xml:space="preserve">. Most signatures were consistently enriched in late-replicating regions across different cancer types, while only two signatures, C_ID10 and C_ID17 (TOP2A K743N mediated mutagenesis), showed enrichment in early-replicating regions. Four signatures were un-affected by replication timing in the majority of cancers presenting this </w:t>
       </w:r>
       <w:r>
         <w:lastRenderedPageBreak/>
-        <w:t xml:space="preserve">C_ID18 (Colibactin exposure), </w:t>
+        <w:t xml:space="preserve">signature, including C_ID1 (Slippage during DNA replication), C_ID5 (Clock-like signature), C_ID18 (Colibactin exposure), </w:t>
       </w:r>
       <w:r>
         <w:rPr>
@@ -2684,11 +2720,11 @@
         <w:t>≥</w:t>
       </w:r>
       <w:r>
-        <w:t xml:space="preserve">2 bases is very different between InsDel_F and ID4: InsDel_F has distinctively high proportions of (i) 2-base deletions with microhomology (almost all TCT → T or TGT → T) and (ii) 2-base deletions from paired 2-base doublets (most often CTCT → CT). InsDel4 has much lower proportions of these two deletion types and also has additional prominent deletion types that are essentially absent in InsDel_F. Theses additional deletion types are mainly deletions of 3 or 4 bases with microhomology and deletions of 3 or 4 bases from paired doublets (e.g. TCTTCT → TCT, GTTTGTTT → GTTT). The spectra in RNase H2 </w:t>
+        <w:t xml:space="preserve">2 bases is very different between InsDel_F and ID4: InsDel_F has distinctively high proportions of (i) 2-base deletions with microhomology (almost all TCT → T or TGT → T) and (ii) 2-base deletions from paired 2-base doublets (most often CTCT → CT). InsDel4 has much lower proportions of these two deletion types and also has additional prominent deletion types that are essentially absent in InsDel_F. Theses additional deletion types are mainly deletions of 3 or 4 bases with microhomology and deletions of 3 or 4 bases from </w:t>
       </w:r>
       <w:r>
         <w:lastRenderedPageBreak/>
-        <w:t>deficient cell lines consist of signatures due to mutational processes intrinsic to the parental cell line combined with high proportions of mutations characteristic of InsDel_F</w:t>
+        <w:t>paired doublets (e.g. TCTTCT → TCT, GTTTGTTT → GTTT). The spectra in RNase H2 deficient cell lines consist of signatures due to mutational processes intrinsic to the parental cell line combined with high proportions of mutations characteristic of InsDel_F</w:t>
       </w:r>
       <w:r>
         <w:rPr>
@@ -2783,14 +2819,14 @@
         <w:rPr>
           <w:rFonts w:eastAsia="宋体"/>
         </w:rPr>
-        <w:t xml:space="preserve">. Male-enriched mutational processes predominated in lung, liver, and "Other" cancer categories. Specifically, lung cancer showed significant male association with InsDel3b (OR = 0.367, q = 0.061) and C_ID3 (OR = 0.397, q = 0.188), signatures previously linked to tobacco exposure, suggesting that higher smoking-related mutational burdens contribute to this enrichment among men. In liver cancer, a similar male predominance was observed for InsDel5a (OR = 0.481, q = 0.118; clock-like) and InsDel8/C_ID8 (OR = 0.271, q = 0.184; associated with DSB repair by NHEJ and age). The "Other" tumor group exhibited male bias in C_ID19 (OR = 0.424, q = 0.188) and InsDel19b (OR = 0.448, q = 0.197). In contrast, female-enriched signatures were found in esophageal and lymphoid malignancies, most notably in esophageal cancer for InsDel1a (OR = 3.85, q = 0.061) and C_ID1 (OR = 3.22, q = 0.188), as well as InsDel1c (OR = </w:t>
+        <w:t xml:space="preserve">. Male-enriched mutational processes predominated in lung, liver, and "Other" cancer categories. Specifically, lung cancer showed significant male association with InsDel3b (OR = 0.367, q = 0.061) and C_ID3 (OR = 0.397, q = 0.188), signatures previously linked to tobacco exposure, suggesting that higher smoking-related mutational burdens contribute to this enrichment among men. In liver cancer, a similar male predominance was observed for InsDel5a (OR = 0.481, q = 0.118; clock-like) and InsDel8/C_ID8 (OR = 0.271, q = 0.184; associated with DSB repair by NHEJ and age). The "Other" tumor group exhibited male bias in C_ID19 (OR = 0.424, q = 0.188) and InsDel19b (OR = 0.448, q = 0.197). In contrast, female-enriched signatures were found in esophageal and lymphoid malignancies, most notably in esophageal cancer for </w:t>
       </w:r>
       <w:r>
         <w:rPr>
           <w:rFonts w:eastAsia="宋体"/>
         </w:rPr>
         <w:lastRenderedPageBreak/>
-        <w:t>2.63, q = 0.194) in lymphoid cancers. No additional signature–cancer type combinations reached a q-value below 0.2. Collectively, these findings suggest that specific mutational processes</w:t>
+        <w:t>InsDel1a (OR = 3.85, q = 0.061) and C_ID1 (OR = 3.22, q = 0.188), as well as InsDel1c (OR = 2.63, q = 0.194) in lymphoid cancers. No additional signature–cancer type combinations reached a q-value below 0.2. Collectively, these findings suggest that specific mutational processes</w:t>
       </w:r>
       <w:r>
         <w:rPr>
@@ -7365,7 +7401,7 @@
         <w:annotationRef/>
       </w:r>
       <w:r>
-        <w:t>Steve to review this paragraph. Mo will add a sup figure for this</w:t>
+        <w:t>Steve to review this paragraph.</w:t>
       </w:r>
     </w:p>
   </w:comment>
@@ -8502,6 +8538,7 @@
   <w:style w:type="character" w:default="1" w:styleId="DefaultParagraphFont">
     <w:name w:val="Default Paragraph Font"/>
     <w:uiPriority w:val="1"/>
+    <w:semiHidden/>
     <w:unhideWhenUsed/>
   </w:style>
   <w:style w:type="table" w:default="1" w:styleId="TableNormal">

</xml_diff>